<commit_message>
Fix ghost bullets + log email body to diagnose empty header extraction
Template: rewrite Jinja '{% for %}'/'{% endfor %}' on every loop control
paragraph to docxtpl paragraph-level form '{%p for %}'/'{%p endfor %}'.
Without the leading 'p', docxtpl substitutes empty text into the paragraph
but leaves the styled paragraph node alone, so List Paragraph loops in
Additional Comments produced empty bulleted lines between content items.

Orchestrator: temporary diagnostic logging — body source, length, first
1500 chars, and which header keys the LLM populated. Need to see this on
Chris's actual forward to fix the empty Name/Grade/Base Location/etc.;
once the prompt is tuned this log goes back to a length-only summary.

Co-Authored-By: Claude Opus 4.7 (1M context) <noreply@anthropic.com>
</commit_message>
<xml_diff>
--- a/templates/pwc_proforma_template.docx
+++ b/templates/pwc_proforma_template.docx
@@ -159,7 +159,7 @@
         </w:numPr>
       </w:pPr>
       <w:r>
-        <w:t>{% for c in header.additional_comments %}</w:t>
+        <w:t>{%p for c in header.additional_comments %}</w:t>
       </w:r>
     </w:p>
     <w:p>
@@ -183,7 +183,7 @@
         </w:numPr>
       </w:pPr>
       <w:r>
-        <w:t>{% endfor %}</w:t>
+        <w:t>{%p endfor %}</w:t>
       </w:r>
     </w:p>
     <w:p/>
@@ -257,7 +257,7 @@
         </w:rPr>
       </w:pPr>
       <w:r>
-        <w:t>{% for p in cv.candidate_profile %}</w:t>
+        <w:t>{%p for p in cv.candidate_profile %}</w:t>
       </w:r>
     </w:p>
     <w:p>
@@ -307,7 +307,7 @@
         </w:rPr>
       </w:pPr>
       <w:r>
-        <w:t>{% endfor %}</w:t>
+        <w:t>{%p endfor %}</w:t>
       </w:r>
     </w:p>
     <w:p>
@@ -374,7 +374,7 @@
     </w:p>
     <w:p>
       <w:r>
-        <w:t>{% for e in cv.education %}</w:t>
+        <w:t>{%p for e in cv.education %}</w:t>
       </w:r>
     </w:p>
     <w:p>
@@ -457,7 +457,7 @@
     </w:p>
     <w:p>
       <w:r>
-        <w:t>{% endfor %}</w:t>
+        <w:t>{%p endfor %}</w:t>
       </w:r>
     </w:p>
     <w:p>
@@ -523,7 +523,7 @@
     </w:p>
     <w:p>
       <w:r>
-        <w:t>{% for role in cv.work_experience %}</w:t>
+        <w:t>{%p for role in cv.work_experience %}</w:t>
       </w:r>
     </w:p>
     <w:p>
@@ -606,7 +606,7 @@
     </w:p>
     <w:p>
       <w:r>
-        <w:t>{% for b in role.bullets %}</w:t>
+        <w:t>{%p for b in role.bullets %}</w:t>
       </w:r>
     </w:p>
     <w:p>
@@ -636,7 +636,7 @@
     </w:p>
     <w:p>
       <w:r>
-        <w:t>{% endfor %}</w:t>
+        <w:t>{%p endfor %}</w:t>
       </w:r>
     </w:p>
     <w:p>
@@ -658,7 +658,7 @@
     </w:p>
     <w:p>
       <w:r>
-        <w:t>{% endfor %}</w:t>
+        <w:t>{%p endfor %}</w:t>
       </w:r>
     </w:p>
     <w:p>
@@ -751,7 +751,7 @@
     </w:p>
     <w:p>
       <w:r>
-        <w:t>{% for s in cv.key_skills_tools %}</w:t>
+        <w:t>{%p for s in cv.key_skills_tools %}</w:t>
       </w:r>
     </w:p>
     <w:p>
@@ -781,7 +781,7 @@
     </w:p>
     <w:p>
       <w:r>
-        <w:t>{% endfor %}</w:t>
+        <w:t>{%p endfor %}</w:t>
       </w:r>
     </w:p>
     <w:p>
@@ -853,7 +853,7 @@
     </w:p>
     <w:p>
       <w:r>
-        <w:t>{% for a in cv.achievements %}</w:t>
+        <w:t>{%p for a in cv.achievements %}</w:t>
       </w:r>
     </w:p>
     <w:p>
@@ -883,7 +883,7 @@
     </w:p>
     <w:p>
       <w:r>
-        <w:t>{% endfor %}</w:t>
+        <w:t>{%p endfor %}</w:t>
       </w:r>
     </w:p>
     <w:p>

</xml_diff>

<commit_message>
Pull availability_to_interview through to the rendered proforma
Move 'availability_to_interview' from header._intel to top-level
header.availability_to_interview, add a new 'Availability to interview:'
line in the template after the Holidays line, and default to '[TBC]' when
the candidate didn't supply one. Joel wants this visible on the proforma
when present so he can sanity-check it at a glance.

Co-Authored-By: Claude Opus 4.7 (1M context) <noreply@anthropic.com>
</commit_message>
<xml_diff>
--- a/templates/pwc_proforma_template.docx
+++ b/templates/pwc_proforma_template.docx
@@ -138,6 +138,14 @@
       </w:r>
       <w:r>
         <w:t xml:space="preserve"> {{ header.holidays_appointments }}</w:t>
+      </w:r>
+    </w:p>
+    <w:p>
+      <w:r>
+        <w:t>Availability to interview:</w:t>
+      </w:r>
+      <w:r>
+        <w:t xml:space="preserve"> {{ header.availability_to_interview }}</w:t>
       </w:r>
     </w:p>
     <w:p>

</xml_diff>

<commit_message>
Generalise CV extract: replace key_skills_tools with other_information
"Key Skills & Tools" was specific to one source CV. The slot is really "any
CV section that isn't profile, education, experience, or achievements"
(Certifications, Languages, Memberships, Hobbies, References, etc.).

Renames the schema field and updates the prompt to instruct the LLM to
preserve each source heading verbatim as the label. Drops the now-redundant
"Key Skills & Tools" subheading from the template; "OTHER INFORMATION"
remains as the section header.

Co-Authored-By: Claude Opus 4.7 (1M context) <noreply@anthropic.com>
</commit_message>
<xml_diff>
--- a/templates/pwc_proforma_template.docx
+++ b/templates/pwc_proforma_template.docx
@@ -724,42 +724,15 @@
         <w:jc w:val="both"/>
         <w:rPr>
           <w:rFonts w:ascii="Calibri Light" w:eastAsia="Times New Roman" w:hAnsi="Calibri Light" w:cs="Calibri Light"/>
-          <w:b/>
           <w:kern w:val="0"/>
           <w:lang w:val="en-IN" w:eastAsia="uk-UA"/>
           <w14:ligatures w14:val="none"/>
         </w:rPr>
       </w:pPr>
-      <w:r>
-        <w:rPr>
-          <w:rFonts w:ascii="Calibri Light" w:eastAsia="Times New Roman" w:hAnsi="Calibri Light" w:cs="Calibri Light"/>
-          <w:b/>
-          <w:kern w:val="0"/>
-          <w:lang w:val="en-IN" w:eastAsia="uk-UA"/>
-          <w14:ligatures w14:val="none"/>
-        </w:rPr>
-        <w:t>Key Skills &amp; Tools</w:t>
-      </w:r>
-    </w:p>
-    <w:p>
-      <w:pPr>
-        <w:tabs>
-          <w:tab w:val="right" w:pos="1980"/>
-          <w:tab w:val="left" w:pos="2520"/>
-        </w:tabs>
-        <w:spacing w:after="0" w:line="240" w:lineRule="auto"/>
-        <w:jc w:val="both"/>
-        <w:rPr>
-          <w:rFonts w:ascii="Calibri Light" w:eastAsia="Times New Roman" w:hAnsi="Calibri Light" w:cs="Calibri Light"/>
-          <w:kern w:val="0"/>
-          <w:lang w:val="en-IN" w:eastAsia="uk-UA"/>
-          <w14:ligatures w14:val="none"/>
-        </w:rPr>
-      </w:pPr>
-    </w:p>
-    <w:p>
-      <w:r>
-        <w:t>{%p for s in cv.key_skills_tools %}</w:t>
+    </w:p>
+    <w:p>
+      <w:r>
+        <w:t>{%p for s in cv.other_information %}</w:t>
       </w:r>
     </w:p>
     <w:p>

</xml_diff>